<commit_message>
feat: add delivery days and contract end date to supply flow, use exact name from partner card
</commit_message>
<xml_diff>
--- a/bot/templates/template_supply_contract.docx
+++ b/bot/templates/template_supply_contract.docx
@@ -2124,6 +2124,12 @@
       </w:r>
     </w:p>
     <w:p>
+      <w:pPr/>
+      <w:r>
+        <w:t>7.2. Срок поставки товара составляет {{ delivery_days }} календарных дней с момента согласования заявки.</w:t>
+      </w:r>
+    </w:p>
+    <w:p>
       <w:pPr>
         <w:shd w:val="clear" w:color="auto" w:fill="FFFFFF"/>
         <w:tabs>
@@ -2909,71 +2915,8 @@
           <w:lang w:eastAsia="ru-RU"/>
         </w:rPr>
       </w:pPr>
-      <w:bookmarkStart w:id="16" w:name="l18"/>
-      <w:bookmarkEnd w:id="16"/>
-      <w:r>
-        <w:rPr>
-          <w:rFonts w:ascii="Times New Roman" w:eastAsia="Times New Roman" w:hAnsi="Times New Roman" w:cs="Times New Roman"/>
-          <w:color w:val="000000" w:themeColor="text1"/>
-          <w:lang w:eastAsia="ru-RU"/>
-        </w:rPr>
-        <w:t>1</w:t>
-      </w:r>
-      <w:r>
-        <w:rPr>
-          <w:rFonts w:ascii="Times New Roman" w:eastAsia="Times New Roman" w:hAnsi="Times New Roman" w:cs="Times New Roman"/>
-          <w:color w:val="000000" w:themeColor="text1"/>
-          <w:lang w:eastAsia="ru-RU"/>
-        </w:rPr>
-        <w:t>1</w:t>
-      </w:r>
-      <w:r>
-        <w:rPr>
-          <w:rFonts w:ascii="Times New Roman" w:eastAsia="Times New Roman" w:hAnsi="Times New Roman" w:cs="Times New Roman"/>
-          <w:color w:val="000000" w:themeColor="text1"/>
-          <w:lang w:eastAsia="ru-RU"/>
-        </w:rPr>
-        <w:t>.1.  Настоящий договор вступает в силу с мо</w:t>
-      </w:r>
-      <w:r>
-        <w:rPr>
-          <w:rFonts w:ascii="Times New Roman" w:eastAsia="Times New Roman" w:hAnsi="Times New Roman" w:cs="Times New Roman"/>
-          <w:color w:val="000000" w:themeColor="text1"/>
-          <w:lang w:eastAsia="ru-RU"/>
-        </w:rPr>
-        <w:t xml:space="preserve">мента подписания и действует </w:t>
-      </w:r>
-      <w:r>
-        <w:rPr>
-          <w:rFonts w:ascii="Times New Roman" w:eastAsia="Times New Roman" w:hAnsi="Times New Roman" w:cs="Times New Roman"/>
-          <w:color w:val="000000" w:themeColor="text1"/>
-          <w:lang w:eastAsia="ru-RU"/>
-        </w:rPr>
-        <w:t>до "31" декабря 202</w:t>
-      </w:r>
-      <w:r>
-        <w:rPr>
-          <w:rFonts w:ascii="Times New Roman" w:eastAsia="Times New Roman" w:hAnsi="Times New Roman" w:cs="Times New Roman"/>
-          <w:color w:val="000000" w:themeColor="text1"/>
-          <w:lang w:eastAsia="ru-RU"/>
-        </w:rPr>
-        <w:t>6</w:t>
-      </w:r>
-      <w:r>
-        <w:rPr>
-          <w:rFonts w:ascii="Times New Roman" w:eastAsia="Times New Roman" w:hAnsi="Times New Roman" w:cs="Times New Roman"/>
-          <w:color w:val="000000" w:themeColor="text1"/>
-          <w:lang w:eastAsia="ru-RU"/>
-        </w:rPr>
-        <w:t xml:space="preserve"> г.,</w:t>
-      </w:r>
-      <w:r>
-        <w:rPr>
-          <w:rFonts w:ascii="Times New Roman" w:eastAsia="Times New Roman" w:hAnsi="Times New Roman" w:cs="Times New Roman"/>
-          <w:color w:val="000000" w:themeColor="text1"/>
-          <w:lang w:eastAsia="ru-RU"/>
-        </w:rPr>
-        <w:t xml:space="preserve"> а в части взаиморасчетов до их полного окончания.</w:t>
+      <w:r>
+        <w:t>11.1.  Настоящий договор вступает в силу с момента подписания и действует до {{ contract_end_date }}, а в части взаиморасчетов до их полного окончания.</w:t>
       </w:r>
     </w:p>
     <w:p>

</xml_diff>

<commit_message>
ux: prompt for start and end date of supply contract instead of delivery days
</commit_message>
<xml_diff>
--- a/bot/templates/template_supply_contract.docx
+++ b/bot/templates/template_supply_contract.docx
@@ -109,60 +109,7 @@
         </w:rPr>
       </w:pPr>
       <w:r>
-        <w:rPr>
-          <w:rFonts w:ascii="Times New Roman" w:eastAsia="Times New Roman" w:hAnsi="Times New Roman" w:cs="Times New Roman"/>
-          <w:color w:val="000000" w:themeColor="text1"/>
-          <w:lang w:eastAsia="ru-RU"/>
-        </w:rPr>
-        <w:t>г. Ахтубинск                                                                                                                         "</w:t>
-      </w:r>
-      <w:r>
-        <w:rPr>
-          <w:rFonts w:ascii="Times New Roman" w:eastAsia="Times New Roman" w:hAnsi="Times New Roman" w:cs="Times New Roman"/>
-          <w:color w:val="000000" w:themeColor="text1"/>
-          <w:lang w:eastAsia="ru-RU"/>
-        </w:rPr>
-        <w:t>08</w:t>
-      </w:r>
-      <w:r>
-        <w:rPr>
-          <w:rFonts w:ascii="Times New Roman" w:eastAsia="Times New Roman" w:hAnsi="Times New Roman" w:cs="Times New Roman"/>
-          <w:color w:val="000000" w:themeColor="text1"/>
-          <w:lang w:eastAsia="ru-RU"/>
-        </w:rPr>
-        <w:t xml:space="preserve">" </w:t>
-      </w:r>
-      <w:r>
-        <w:rPr>
-          <w:rFonts w:ascii="Times New Roman" w:eastAsia="Times New Roman" w:hAnsi="Times New Roman" w:cs="Times New Roman"/>
-          <w:color w:val="000000" w:themeColor="text1"/>
-          <w:lang w:eastAsia="ru-RU"/>
-        </w:rPr>
-        <w:t>июня</w:t>
-      </w:r>
-      <w:r>
-        <w:rPr>
-          <w:rFonts w:ascii="Times New Roman" w:eastAsia="Times New Roman" w:hAnsi="Times New Roman" w:cs="Times New Roman"/>
-          <w:color w:val="000000" w:themeColor="text1"/>
-          <w:lang w:eastAsia="ru-RU"/>
-        </w:rPr>
-        <w:t xml:space="preserve">  202</w:t>
-      </w:r>
-      <w:r>
-        <w:rPr>
-          <w:rFonts w:ascii="Times New Roman" w:eastAsia="Times New Roman" w:hAnsi="Times New Roman" w:cs="Times New Roman"/>
-          <w:color w:val="000000" w:themeColor="text1"/>
-          <w:lang w:eastAsia="ru-RU"/>
-        </w:rPr>
-        <w:t>6</w:t>
-      </w:r>
-      <w:r>
-        <w:rPr>
-          <w:rFonts w:ascii="Times New Roman" w:eastAsia="Times New Roman" w:hAnsi="Times New Roman" w:cs="Times New Roman"/>
-          <w:color w:val="000000" w:themeColor="text1"/>
-          <w:lang w:eastAsia="ru-RU"/>
-        </w:rPr>
-        <w:t xml:space="preserve"> г.</w:t>
+        <w:t>г. Ахтубинск                                                                                                                         {{ contract_start_date }}</w:t>
       </w:r>
     </w:p>
     <w:p>
@@ -2121,12 +2068,6 @@
           <w:lang w:eastAsia="ru-RU"/>
         </w:rPr>
         <w:t xml:space="preserve"> поставка товара осуществляется путем самовывоза (выборки) товара со слада Поставщика или иного места передачи товара, определенного по взаимной договоренности Сторон.</w:t>
-      </w:r>
-    </w:p>
-    <w:p>
-      <w:pPr/>
-      <w:r>
-        <w:t>7.2. Срок поставки товара составляет {{ delivery_days }} календарных дней с момента согласования заявки.</w:t>
       </w:r>
     </w:p>
     <w:p>

</xml_diff>

<commit_message>
fix: use correctly formatted short org title (e.g., ИП ГКФХ Ким В.Р.) in signature block
</commit_message>
<xml_diff>
--- a/bot/templates/template_supply_contract.docx
+++ b/bot/templates/template_supply_contract.docx
@@ -3605,10 +3605,7 @@
                     <w:spacing w:after="0"/>
                   </w:pPr>
                   <w:r>
-                    <w:rPr>
-                      <w:rFonts w:ascii="Times New Roman" w:hAnsi="Times New Roman" w:cs="Times New Roman"/>
-                    </w:rPr>
-                    <w:t xml:space="preserve">{{ supplier_sign_title }} {{ supplier_name }}</w:t>
+                    <w:t>{{ supplier_sign_org }}</w:t>
                   </w:r>
                 </w:p>
                 <w:p>
@@ -3649,10 +3646,7 @@
                     <w:spacing w:after="0"/>
                   </w:pPr>
                   <w:r>
-                    <w:rPr>
-                      <w:rFonts w:ascii="Times New Roman" w:hAnsi="Times New Roman" w:cs="Times New Roman"/>
-                    </w:rPr>
-                    <w:t xml:space="preserve">{{ buyer_sign_title }} {{ buyer_name }}</w:t>
+                    <w:t>{{ buyer_sign_org }}</w:t>
                   </w:r>
                 </w:p>
                 <w:p>

</xml_diff>